<commit_message>
Description de la modification
</commit_message>
<xml_diff>
--- a/doc/transcription.docx
+++ b/doc/transcription.docx
@@ -4,7 +4,15 @@
   <w:body>
     <w:p>
       <w:r>
-        <w:t xml:space="preserve">But : depuis un fichier audio , format m4a. Effectuer une transcription en différenciant les voix des protagonistes. Recherche d'un traitement performant, pas de solution </w:t>
+        <w:t xml:space="preserve">But : depuis un fichier </w:t>
+      </w:r>
+      <w:proofErr w:type="gramStart"/>
+      <w:r>
+        <w:t>audio ,</w:t>
+      </w:r>
+      <w:proofErr w:type="gramEnd"/>
+      <w:r>
+        <w:t xml:space="preserve"> format m4a. Effectuer une transcription en différenciant les voix des protagonistes. Recherche d'un traitement performant, pas de solution </w:t>
       </w:r>
       <w:proofErr w:type="spellStart"/>
       <w:r>
@@ -12,7 +20,15 @@
       </w:r>
       <w:proofErr w:type="spellEnd"/>
       <w:r>
-        <w:t xml:space="preserve">, usage local du PC peu recommandé. Utilisation de https://github.com/OCLOUX demandée localement si besoin : utiliser uniquement : C:\scripts\Transcription , aucun autre </w:t>
+        <w:t xml:space="preserve">, usage local du PC peu recommandé. Utilisation de https://github.com/OCLOUX demandée localement si besoin : utiliser uniquement : </w:t>
+      </w:r>
+      <w:proofErr w:type="gramStart"/>
+      <w:r>
+        <w:t>C:\scripts\Transcription ,</w:t>
+      </w:r>
+      <w:proofErr w:type="gramEnd"/>
+      <w:r>
+        <w:t xml:space="preserve"> aucun autre </w:t>
       </w:r>
       <w:proofErr w:type="spellStart"/>
       <w:r>
@@ -45,6 +61,50 @@
       </w:r>
     </w:p>
     <w:p/>
+    <w:p>
+      <w:hyperlink r:id="rId5" w:history="1">
+        <w:proofErr w:type="spellStart"/>
+        <w:r>
+          <w:rPr>
+            <w:rStyle w:val="Lienhypertexte"/>
+          </w:rPr>
+          <w:t>Hugging</w:t>
+        </w:r>
+        <w:proofErr w:type="spellEnd"/>
+        <w:r>
+          <w:rPr>
+            <w:rStyle w:val="Lienhypertexte"/>
+          </w:rPr>
+          <w:t xml:space="preserve"> Face – The AI </w:t>
+        </w:r>
+        <w:proofErr w:type="spellStart"/>
+        <w:r>
+          <w:rPr>
+            <w:rStyle w:val="Lienhypertexte"/>
+          </w:rPr>
+          <w:t>community</w:t>
+        </w:r>
+        <w:proofErr w:type="spellEnd"/>
+        <w:r>
+          <w:rPr>
+            <w:rStyle w:val="Lienhypertexte"/>
+          </w:rPr>
+          <w:t xml:space="preserve"> building the future.</w:t>
+        </w:r>
+      </w:hyperlink>
+    </w:p>
+    <w:p>
+      <w:proofErr w:type="spellStart"/>
+      <w:proofErr w:type="gramStart"/>
+      <w:r>
+        <w:t>hf</w:t>
+      </w:r>
+      <w:proofErr w:type="gramEnd"/>
+      <w:r>
+        <w:t>_EjGIbzvDIpAypsNSFezFXIzJooaVLzbnpF</w:t>
+      </w:r>
+      <w:proofErr w:type="spellEnd"/>
+    </w:p>
     <w:p/>
     <w:tbl>
       <w:tblPr>
@@ -116,7 +176,15 @@
             </w:r>
             <w:proofErr w:type="spellEnd"/>
             <w:r>
-              <w:t>). La solution doit être open-source, locale, et offrir un bon équilibre entre précision et performance pour un PC moyen sans GPU dédié. Les résultats doivent être sous forme de texte simple avec des étiquettes de locuteur (ex: [Locuteur 1] Bonjour), placés directement dans le répertoire C:\scripts\Transcription avec un nom basé sur le fichier source. La solution doit pouvoir traiter à la fois un seul fichier et un lot de fichiers.</w:t>
+              <w:t>). La solution doit être open-source, locale, et offrir un bon équilibre entre précision et performance pour un PC moyen sans GPU dédié. Les résultats doivent être sous forme de texte simple avec des étiquettes de locuteur (</w:t>
+            </w:r>
+            <w:proofErr w:type="gramStart"/>
+            <w:r>
+              <w:t>ex:</w:t>
+            </w:r>
+            <w:proofErr w:type="gramEnd"/>
+            <w:r>
+              <w:t xml:space="preserve"> [Locuteur 1] Bonjour), placés directement dans le répertoire C:\scripts\Transcription avec un nom basé sur le fichier source. La solution doit pouvoir traiter à la fois un seul fichier et un lot de fichiers.</w:t>
             </w:r>
           </w:p>
           <w:p>
@@ -262,6 +330,7 @@
                 <w:b/>
                 <w:bCs/>
               </w:rPr>
+              <w:lastRenderedPageBreak/>
               <w:t>Étapes détaillées</w:t>
             </w:r>
           </w:p>
@@ -326,14 +395,15 @@
               </w:numPr>
             </w:pPr>
             <w:r>
-              <w:lastRenderedPageBreak/>
               <w:t>Installer le package Python nécessaire : </w:t>
             </w:r>
             <w:proofErr w:type="spellStart"/>
+            <w:proofErr w:type="gramStart"/>
             <w:r>
               <w:t>pyannote.audio</w:t>
             </w:r>
             <w:proofErr w:type="spellEnd"/>
+            <w:proofErr w:type="gramEnd"/>
             <w:r>
               <w:t xml:space="preserve"> (les autres dépendances comme </w:t>
             </w:r>
@@ -387,10 +457,12 @@
           </w:p>
           <w:p>
             <w:proofErr w:type="spellStart"/>
+            <w:proofErr w:type="gramStart"/>
             <w:r>
               <w:t>ffmpeg</w:t>
             </w:r>
             <w:proofErr w:type="spellEnd"/>
+            <w:proofErr w:type="gramEnd"/>
             <w:r>
               <w:t xml:space="preserve"> -i input.m4a -</w:t>
             </w:r>
@@ -411,10 +483,12 @@
               <w:t xml:space="preserve"> 1 -</w:t>
             </w:r>
             <w:proofErr w:type="spellStart"/>
+            <w:proofErr w:type="gramStart"/>
             <w:r>
               <w:t>c:a</w:t>
             </w:r>
             <w:proofErr w:type="spellEnd"/>
+            <w:proofErr w:type="gramEnd"/>
             <w:r>
               <w:t xml:space="preserve"> pcm_s16le output.wav</w:t>
             </w:r>
@@ -468,8 +542,13 @@
             </w:r>
           </w:p>
           <w:p>
-            <w:r>
-              <w:t xml:space="preserve">import </w:t>
+            <w:proofErr w:type="gramStart"/>
+            <w:r>
+              <w:t>import</w:t>
+            </w:r>
+            <w:proofErr w:type="gramEnd"/>
+            <w:r>
+              <w:t xml:space="preserve"> </w:t>
             </w:r>
             <w:proofErr w:type="spellStart"/>
             <w:r>
@@ -479,10 +558,12 @@
           </w:p>
           <w:p>
             <w:proofErr w:type="spellStart"/>
+            <w:proofErr w:type="gramStart"/>
             <w:r>
               <w:t>device</w:t>
             </w:r>
             <w:proofErr w:type="spellEnd"/>
+            <w:proofErr w:type="gramEnd"/>
             <w:r>
               <w:t xml:space="preserve"> = "</w:t>
             </w:r>
@@ -491,8 +572,13 @@
               <w:t>cpu</w:t>
             </w:r>
             <w:proofErr w:type="spellEnd"/>
-            <w:r>
-              <w:t>"  # ou "</w:t>
+            <w:proofErr w:type="gramStart"/>
+            <w:r>
+              <w:t>"  #</w:t>
+            </w:r>
+            <w:proofErr w:type="gramEnd"/>
+            <w:r>
+              <w:t xml:space="preserve"> ou "</w:t>
             </w:r>
             <w:proofErr w:type="spellStart"/>
             <w:r>
@@ -505,36 +591,247 @@
           </w:p>
           <w:p>
             <w:proofErr w:type="spellStart"/>
+            <w:proofErr w:type="gramStart"/>
+            <w:r>
+              <w:t>batch</w:t>
+            </w:r>
+            <w:proofErr w:type="gramEnd"/>
+            <w:r>
+              <w:t>_size</w:t>
+            </w:r>
+            <w:proofErr w:type="spellEnd"/>
+            <w:r>
+              <w:t xml:space="preserve"> = </w:t>
+            </w:r>
+            <w:proofErr w:type="gramStart"/>
+            <w:r>
+              <w:t>16  #</w:t>
+            </w:r>
+            <w:proofErr w:type="gramEnd"/>
+            <w:r>
+              <w:t xml:space="preserve"> réduire si mémoire limitée</w:t>
+            </w:r>
+          </w:p>
+          <w:p>
+            <w:proofErr w:type="spellStart"/>
+            <w:proofErr w:type="gramStart"/>
+            <w:r>
+              <w:t>compute</w:t>
+            </w:r>
+            <w:proofErr w:type="gramEnd"/>
+            <w:r>
+              <w:t>_type</w:t>
+            </w:r>
+            <w:proofErr w:type="spellEnd"/>
+            <w:r>
+              <w:t xml:space="preserve"> = "int8</w:t>
+            </w:r>
+            <w:proofErr w:type="gramStart"/>
+            <w:r>
+              <w:t>"  #</w:t>
+            </w:r>
+            <w:proofErr w:type="gramEnd"/>
+            <w:r>
+              <w:t xml:space="preserve"> ou "float16" pour plus de précision si GPU</w:t>
+            </w:r>
+          </w:p>
+          <w:p/>
+          <w:p>
+            <w:proofErr w:type="gramStart"/>
+            <w:r>
+              <w:t>model</w:t>
+            </w:r>
+            <w:proofErr w:type="gramEnd"/>
+            <w:r>
+              <w:t xml:space="preserve"> = </w:t>
+            </w:r>
+            <w:proofErr w:type="spellStart"/>
+            <w:proofErr w:type="gramStart"/>
+            <w:r>
+              <w:t>whisperx.load</w:t>
+            </w:r>
+            <w:proofErr w:type="gramEnd"/>
+            <w:r>
+              <w:t>_</w:t>
+            </w:r>
+            <w:proofErr w:type="gramStart"/>
+            <w:r>
+              <w:t>model</w:t>
+            </w:r>
+            <w:proofErr w:type="spellEnd"/>
+            <w:r>
+              <w:t>(</w:t>
+            </w:r>
+            <w:proofErr w:type="gramEnd"/>
+            <w:r>
+              <w:t xml:space="preserve">"medium", </w:t>
+            </w:r>
+            <w:proofErr w:type="spellStart"/>
+            <w:r>
+              <w:t>device</w:t>
+            </w:r>
+            <w:proofErr w:type="spellEnd"/>
+            <w:r>
+              <w:t xml:space="preserve">, </w:t>
+            </w:r>
+            <w:proofErr w:type="spellStart"/>
+            <w:r>
+              <w:t>compute_type</w:t>
+            </w:r>
+            <w:proofErr w:type="spellEnd"/>
+            <w:r>
+              <w:t>=</w:t>
+            </w:r>
+            <w:proofErr w:type="spellStart"/>
+            <w:r>
+              <w:t>compute_type</w:t>
+            </w:r>
+            <w:proofErr w:type="spellEnd"/>
+            <w:r>
+              <w:t>)</w:t>
+            </w:r>
+          </w:p>
+          <w:p>
+            <w:proofErr w:type="gramStart"/>
+            <w:r>
+              <w:t>audio</w:t>
+            </w:r>
+            <w:proofErr w:type="gramEnd"/>
+            <w:r>
+              <w:t xml:space="preserve"> = </w:t>
+            </w:r>
+            <w:proofErr w:type="spellStart"/>
+            <w:proofErr w:type="gramStart"/>
+            <w:r>
+              <w:t>whisperx.load</w:t>
+            </w:r>
+            <w:proofErr w:type="gramEnd"/>
+            <w:r>
+              <w:t>_audio</w:t>
+            </w:r>
+            <w:proofErr w:type="spellEnd"/>
+            <w:r>
+              <w:t>("output.wav")</w:t>
+            </w:r>
+          </w:p>
+          <w:p>
+            <w:proofErr w:type="spellStart"/>
+            <w:proofErr w:type="gramStart"/>
+            <w:r>
+              <w:t>result</w:t>
+            </w:r>
+            <w:proofErr w:type="spellEnd"/>
+            <w:proofErr w:type="gramEnd"/>
+            <w:r>
+              <w:t xml:space="preserve"> = </w:t>
+            </w:r>
+            <w:proofErr w:type="spellStart"/>
+            <w:proofErr w:type="gramStart"/>
+            <w:r>
+              <w:t>model.transcribe</w:t>
+            </w:r>
+            <w:proofErr w:type="spellEnd"/>
+            <w:proofErr w:type="gramEnd"/>
+            <w:r>
+              <w:t xml:space="preserve">(audio, </w:t>
+            </w:r>
+            <w:proofErr w:type="spellStart"/>
             <w:r>
               <w:t>batch_size</w:t>
             </w:r>
             <w:proofErr w:type="spellEnd"/>
             <w:r>
-              <w:t xml:space="preserve"> = 16  # réduire si mémoire limitée</w:t>
-            </w:r>
-          </w:p>
-          <w:p>
-            <w:proofErr w:type="spellStart"/>
-            <w:r>
-              <w:t>compute_type</w:t>
-            </w:r>
-            <w:proofErr w:type="spellEnd"/>
-            <w:r>
-              <w:t xml:space="preserve"> = "int8"  # ou "float16" pour plus de précision si GPU</w:t>
+              <w:t>=</w:t>
+            </w:r>
+            <w:proofErr w:type="spellStart"/>
+            <w:r>
+              <w:t>batch_size</w:t>
+            </w:r>
+            <w:proofErr w:type="spellEnd"/>
+            <w:r>
+              <w:t xml:space="preserve">, </w:t>
+            </w:r>
+            <w:proofErr w:type="spellStart"/>
+            <w:r>
+              <w:t>language</w:t>
+            </w:r>
+            <w:proofErr w:type="spellEnd"/>
+            <w:r>
+              <w:t>="</w:t>
+            </w:r>
+            <w:proofErr w:type="spellStart"/>
+            <w:r>
+              <w:t>fr</w:t>
+            </w:r>
+            <w:proofErr w:type="spellEnd"/>
+            <w:r>
+              <w:t>")</w:t>
             </w:r>
           </w:p>
           <w:p/>
           <w:p>
             <w:r>
-              <w:t xml:space="preserve">model = </w:t>
-            </w:r>
-            <w:proofErr w:type="spellStart"/>
-            <w:r>
-              <w:t>whisperx.load_model</w:t>
-            </w:r>
-            <w:proofErr w:type="spellEnd"/>
-            <w:r>
-              <w:t xml:space="preserve">("medium", </w:t>
+              <w:t># Alignement forcé pour améliorer les timestamps au niveau des mots</w:t>
+            </w:r>
+          </w:p>
+          <w:p>
+            <w:proofErr w:type="spellStart"/>
+            <w:proofErr w:type="gramStart"/>
+            <w:r>
+              <w:t>model</w:t>
+            </w:r>
+            <w:proofErr w:type="gramEnd"/>
+            <w:r>
+              <w:t>_a</w:t>
+            </w:r>
+            <w:proofErr w:type="spellEnd"/>
+            <w:r>
+              <w:t xml:space="preserve">, </w:t>
+            </w:r>
+            <w:proofErr w:type="spellStart"/>
+            <w:r>
+              <w:t>metadata</w:t>
+            </w:r>
+            <w:proofErr w:type="spellEnd"/>
+            <w:r>
+              <w:t xml:space="preserve"> = </w:t>
+            </w:r>
+            <w:proofErr w:type="spellStart"/>
+            <w:proofErr w:type="gramStart"/>
+            <w:r>
+              <w:t>whisperx.load</w:t>
+            </w:r>
+            <w:proofErr w:type="gramEnd"/>
+            <w:r>
+              <w:t>_align_model</w:t>
+            </w:r>
+            <w:proofErr w:type="spellEnd"/>
+            <w:r>
+              <w:t>(</w:t>
+            </w:r>
+            <w:proofErr w:type="spellStart"/>
+            <w:r>
+              <w:t>language_code</w:t>
+            </w:r>
+            <w:proofErr w:type="spellEnd"/>
+            <w:r>
+              <w:t>=</w:t>
+            </w:r>
+            <w:proofErr w:type="spellStart"/>
+            <w:r>
+              <w:t>result</w:t>
+            </w:r>
+            <w:proofErr w:type="spellEnd"/>
+            <w:r>
+              <w:t>["</w:t>
+            </w:r>
+            <w:proofErr w:type="spellStart"/>
+            <w:r>
+              <w:t>language</w:t>
+            </w:r>
+            <w:proofErr w:type="spellEnd"/>
+            <w:r>
+              <w:t xml:space="preserve">"], </w:t>
             </w:r>
             <w:proofErr w:type="spellStart"/>
             <w:r>
@@ -542,19 +839,11 @@
             </w:r>
             <w:proofErr w:type="spellEnd"/>
             <w:r>
-              <w:t xml:space="preserve">, </w:t>
-            </w:r>
-            <w:proofErr w:type="spellStart"/>
-            <w:r>
-              <w:t>compute_type</w:t>
-            </w:r>
-            <w:proofErr w:type="spellEnd"/>
-            <w:r>
               <w:t>=</w:t>
             </w:r>
             <w:proofErr w:type="spellStart"/>
             <w:r>
-              <w:t>compute_type</w:t>
+              <w:t>device</w:t>
             </w:r>
             <w:proofErr w:type="spellEnd"/>
             <w:r>
@@ -562,154 +851,23 @@
             </w:r>
           </w:p>
           <w:p>
-            <w:r>
-              <w:t xml:space="preserve">audio = </w:t>
-            </w:r>
-            <w:proofErr w:type="spellStart"/>
-            <w:r>
-              <w:t>whisperx.load_audio</w:t>
-            </w:r>
-            <w:proofErr w:type="spellEnd"/>
-            <w:r>
-              <w:t>("output.wav")</w:t>
-            </w:r>
-          </w:p>
-          <w:p>
-            <w:proofErr w:type="spellStart"/>
+            <w:proofErr w:type="spellStart"/>
+            <w:proofErr w:type="gramStart"/>
             <w:r>
               <w:t>result</w:t>
             </w:r>
             <w:proofErr w:type="spellEnd"/>
+            <w:proofErr w:type="gramEnd"/>
             <w:r>
               <w:t xml:space="preserve"> = </w:t>
             </w:r>
             <w:proofErr w:type="spellStart"/>
-            <w:r>
-              <w:t>model.transcribe</w:t>
-            </w:r>
-            <w:proofErr w:type="spellEnd"/>
-            <w:r>
-              <w:t xml:space="preserve">(audio, </w:t>
-            </w:r>
-            <w:proofErr w:type="spellStart"/>
-            <w:r>
-              <w:t>batch_size</w:t>
-            </w:r>
-            <w:proofErr w:type="spellEnd"/>
-            <w:r>
-              <w:t>=</w:t>
-            </w:r>
-            <w:proofErr w:type="spellStart"/>
-            <w:r>
-              <w:t>batch_size</w:t>
-            </w:r>
-            <w:proofErr w:type="spellEnd"/>
-            <w:r>
-              <w:t xml:space="preserve">, </w:t>
-            </w:r>
-            <w:proofErr w:type="spellStart"/>
-            <w:r>
-              <w:t>language</w:t>
-            </w:r>
-            <w:proofErr w:type="spellEnd"/>
-            <w:r>
-              <w:t>="</w:t>
-            </w:r>
-            <w:proofErr w:type="spellStart"/>
-            <w:r>
-              <w:t>fr</w:t>
-            </w:r>
-            <w:proofErr w:type="spellEnd"/>
-            <w:r>
-              <w:t>")</w:t>
-            </w:r>
-          </w:p>
-          <w:p/>
-          <w:p>
-            <w:r>
-              <w:t># Alignement forcé pour améliorer les timestamps au niveau des mots</w:t>
-            </w:r>
-          </w:p>
-          <w:p>
-            <w:proofErr w:type="spellStart"/>
-            <w:r>
-              <w:t>model_a</w:t>
-            </w:r>
-            <w:proofErr w:type="spellEnd"/>
-            <w:r>
-              <w:t xml:space="preserve">, </w:t>
-            </w:r>
-            <w:proofErr w:type="spellStart"/>
-            <w:r>
-              <w:t>metadata</w:t>
-            </w:r>
-            <w:proofErr w:type="spellEnd"/>
-            <w:r>
-              <w:t xml:space="preserve"> = </w:t>
-            </w:r>
-            <w:proofErr w:type="spellStart"/>
-            <w:r>
-              <w:t>whisperx.load_align_model</w:t>
-            </w:r>
-            <w:proofErr w:type="spellEnd"/>
-            <w:r>
-              <w:t>(</w:t>
-            </w:r>
-            <w:proofErr w:type="spellStart"/>
-            <w:r>
-              <w:t>language_code</w:t>
-            </w:r>
-            <w:proofErr w:type="spellEnd"/>
-            <w:r>
-              <w:t>=</w:t>
-            </w:r>
-            <w:proofErr w:type="spellStart"/>
-            <w:r>
-              <w:t>result</w:t>
-            </w:r>
-            <w:proofErr w:type="spellEnd"/>
-            <w:r>
-              <w:t>["</w:t>
-            </w:r>
-            <w:proofErr w:type="spellStart"/>
-            <w:r>
-              <w:t>language</w:t>
-            </w:r>
-            <w:proofErr w:type="spellEnd"/>
-            <w:r>
-              <w:t xml:space="preserve">"], </w:t>
-            </w:r>
-            <w:proofErr w:type="spellStart"/>
-            <w:r>
-              <w:t>device</w:t>
-            </w:r>
-            <w:proofErr w:type="spellEnd"/>
-            <w:r>
-              <w:t>=</w:t>
-            </w:r>
-            <w:proofErr w:type="spellStart"/>
-            <w:r>
-              <w:t>device</w:t>
-            </w:r>
-            <w:proofErr w:type="spellEnd"/>
-            <w:r>
-              <w:t>)</w:t>
-            </w:r>
-          </w:p>
-          <w:p>
-            <w:proofErr w:type="spellStart"/>
-            <w:r>
-              <w:t>result</w:t>
-            </w:r>
-            <w:proofErr w:type="spellEnd"/>
-            <w:r>
-              <w:t xml:space="preserve"> = </w:t>
-            </w:r>
-            <w:proofErr w:type="spellStart"/>
+            <w:proofErr w:type="gramStart"/>
             <w:r>
               <w:t>whisperx.align</w:t>
             </w:r>
             <w:proofErr w:type="spellEnd"/>
+            <w:proofErr w:type="gramEnd"/>
             <w:r>
               <w:t>(</w:t>
             </w:r>
@@ -855,25 +1013,34 @@
           </w:p>
           <w:p>
             <w:proofErr w:type="spellStart"/>
+            <w:proofErr w:type="gramStart"/>
             <w:r>
               <w:t>from</w:t>
             </w:r>
             <w:proofErr w:type="spellEnd"/>
+            <w:proofErr w:type="gramEnd"/>
             <w:r>
               <w:t xml:space="preserve"> </w:t>
             </w:r>
             <w:proofErr w:type="spellStart"/>
+            <w:proofErr w:type="gramStart"/>
             <w:r>
               <w:t>pyannote.audio</w:t>
             </w:r>
             <w:proofErr w:type="spellEnd"/>
+            <w:proofErr w:type="gramEnd"/>
             <w:r>
               <w:t xml:space="preserve"> import Pipeline</w:t>
             </w:r>
           </w:p>
           <w:p>
-            <w:r>
-              <w:t xml:space="preserve">pipeline = </w:t>
+            <w:proofErr w:type="gramStart"/>
+            <w:r>
+              <w:t>pipeline</w:t>
+            </w:r>
+            <w:proofErr w:type="gramEnd"/>
+            <w:r>
+              <w:t xml:space="preserve"> = </w:t>
             </w:r>
             <w:proofErr w:type="spellStart"/>
             <w:r>
@@ -902,10 +1069,12 @@
           </w:p>
           <w:p>
             <w:proofErr w:type="spellStart"/>
+            <w:proofErr w:type="gramStart"/>
             <w:r>
               <w:t>diarization</w:t>
             </w:r>
             <w:proofErr w:type="spellEnd"/>
+            <w:proofErr w:type="gramEnd"/>
             <w:r>
               <w:t xml:space="preserve"> = pipeline("output.wav")</w:t>
             </w:r>
@@ -964,7 +1133,15 @@
               </w:numPr>
             </w:pPr>
             <w:r>
-              <w:t>Le résultat contient des segments avec des étiquettes de locuteur (ex: "SPEAKER_00", "SPEAKER_01").</w:t>
+              <w:t>Le résultat contient des segments avec des étiquettes de locuteur (</w:t>
+            </w:r>
+            <w:proofErr w:type="gramStart"/>
+            <w:r>
+              <w:t>ex:</w:t>
+            </w:r>
+            <w:proofErr w:type="gramEnd"/>
+            <w:r>
+              <w:t xml:space="preserve"> "SPEAKER_00", "SPEAKER_01").</w:t>
             </w:r>
           </w:p>
           <w:p>
@@ -1004,6 +1181,7 @@
               </w:numPr>
             </w:pPr>
             <w:r>
+              <w:lastRenderedPageBreak/>
               <w:t xml:space="preserve">Déterminer quel segment de </w:t>
             </w:r>
             <w:proofErr w:type="spellStart"/>
@@ -1051,7 +1229,6 @@
           </w:p>
           <w:p>
             <w:r>
-              <w:lastRenderedPageBreak/>
               <w:t>Écrire le résultat dans un fichier texte :</w:t>
             </w:r>
           </w:p>
@@ -1063,7 +1240,23 @@
               </w:numPr>
             </w:pPr>
             <w:r>
-              <w:t>Nom de sortie : [nom_fichier_source]_transcription.txt (ex: reunion_transcription.txt)</w:t>
+              <w:t>Nom de sortie : [nom_fichier_</w:t>
+            </w:r>
+            <w:proofErr w:type="gramStart"/>
+            <w:r>
+              <w:t>source]_transcription.txt</w:t>
+            </w:r>
+            <w:proofErr w:type="gramEnd"/>
+            <w:r>
+              <w:t> (</w:t>
+            </w:r>
+            <w:proofErr w:type="gramStart"/>
+            <w:r>
+              <w:t>ex:</w:t>
+            </w:r>
+            <w:proofErr w:type="gramEnd"/>
+            <w:r>
+              <w:t> reunion_transcription.txt)</w:t>
             </w:r>
           </w:p>
           <w:p>
@@ -1210,10 +1403,12 @@
               <w:t xml:space="preserve"> Face pour </w:t>
             </w:r>
             <w:proofErr w:type="spellStart"/>
+            <w:proofErr w:type="gramStart"/>
             <w:r>
               <w:t>pyannote.audio</w:t>
             </w:r>
             <w:proofErr w:type="spellEnd"/>
+            <w:proofErr w:type="gramEnd"/>
             <w:r>
               <w:t>.</w:t>
             </w:r>
@@ -1279,10 +1474,12 @@
               </w:numPr>
             </w:pPr>
             <w:proofErr w:type="spellStart"/>
+            <w:proofErr w:type="gramStart"/>
             <w:r>
               <w:t>pyannote.audio</w:t>
             </w:r>
             <w:proofErr w:type="spellEnd"/>
+            <w:proofErr w:type="gramEnd"/>
             <w:r>
               <w:t xml:space="preserve"> (à installer)</w:t>
             </w:r>
@@ -1295,10 +1492,12 @@
               </w:numPr>
             </w:pPr>
             <w:proofErr w:type="spellStart"/>
+            <w:proofErr w:type="gramStart"/>
             <w:r>
               <w:t>whisperx</w:t>
             </w:r>
             <w:proofErr w:type="spellEnd"/>
+            <w:proofErr w:type="gramEnd"/>
             <w:r>
               <w:t xml:space="preserve"> (déjà installé sur le système)</w:t>
             </w:r>
@@ -1311,10 +1510,12 @@
               </w:numPr>
             </w:pPr>
             <w:proofErr w:type="spellStart"/>
+            <w:proofErr w:type="gramStart"/>
             <w:r>
               <w:t>torch</w:t>
             </w:r>
             <w:proofErr w:type="spellEnd"/>
+            <w:proofErr w:type="gramEnd"/>
             <w:r>
               <w:t xml:space="preserve"> (déjà présent, version 2.9.1+cpu)</w:t>
             </w:r>
@@ -1327,8 +1528,13 @@
               </w:numPr>
             </w:pPr>
             <w:proofErr w:type="spellStart"/>
-            <w:r>
-              <w:t>faster-whisper</w:t>
+            <w:proofErr w:type="gramStart"/>
+            <w:r>
+              <w:t>faster</w:t>
+            </w:r>
+            <w:proofErr w:type="gramEnd"/>
+            <w:r>
+              <w:t>-whisper</w:t>
             </w:r>
             <w:proofErr w:type="spellEnd"/>
             <w:r>
@@ -1359,10 +1565,12 @@
               </w:numPr>
             </w:pPr>
             <w:proofErr w:type="spellStart"/>
+            <w:proofErr w:type="gramStart"/>
             <w:r>
               <w:t>torchaudio</w:t>
             </w:r>
             <w:proofErr w:type="spellEnd"/>
+            <w:proofErr w:type="gramEnd"/>
             <w:r>
               <w:t xml:space="preserve"> (</w:t>
             </w:r>
@@ -1391,10 +1599,12 @@
               </w:numPr>
             </w:pPr>
             <w:proofErr w:type="spellStart"/>
+            <w:proofErr w:type="gramStart"/>
             <w:r>
               <w:t>transformers</w:t>
             </w:r>
             <w:proofErr w:type="spellEnd"/>
+            <w:proofErr w:type="gramEnd"/>
             <w:r>
               <w:t xml:space="preserve"> (</w:t>
             </w:r>
@@ -1423,10 +1633,12 @@
               </w:numPr>
             </w:pPr>
             <w:proofErr w:type="spellStart"/>
+            <w:proofErr w:type="gramStart"/>
             <w:r>
               <w:t>nltk</w:t>
             </w:r>
             <w:proofErr w:type="spellEnd"/>
+            <w:proofErr w:type="gramEnd"/>
             <w:r>
               <w:t xml:space="preserve"> (</w:t>
             </w:r>
@@ -1455,10 +1667,12 @@
               </w:numPr>
             </w:pPr>
             <w:proofErr w:type="spellStart"/>
+            <w:proofErr w:type="gramStart"/>
             <w:r>
               <w:t>librosa</w:t>
             </w:r>
             <w:proofErr w:type="spellEnd"/>
+            <w:proofErr w:type="gramEnd"/>
             <w:r>
               <w:t xml:space="preserve"> (pour le traitement audio, peut nécessiter d'être installé)</w:t>
             </w:r>
@@ -1471,10 +1685,12 @@
               </w:numPr>
             </w:pPr>
             <w:proofErr w:type="spellStart"/>
+            <w:proofErr w:type="gramStart"/>
             <w:r>
               <w:t>numpy</w:t>
             </w:r>
             <w:proofErr w:type="spellEnd"/>
+            <w:proofErr w:type="gramEnd"/>
             <w:r>
               <w:t xml:space="preserve"> (déjà présent)</w:t>
             </w:r>
@@ -1487,10 +1703,12 @@
               </w:numPr>
             </w:pPr>
             <w:proofErr w:type="spellStart"/>
+            <w:proofErr w:type="gramStart"/>
             <w:r>
               <w:t>tqdm</w:t>
             </w:r>
             <w:proofErr w:type="spellEnd"/>
+            <w:proofErr w:type="gramEnd"/>
             <w:r>
               <w:t xml:space="preserve"> (pour la barre de progression, optionnel mais recommandé)</w:t>
             </w:r>
@@ -1545,6 +1763,7 @@
               </w:numPr>
             </w:pPr>
             <w:r>
+              <w:lastRenderedPageBreak/>
               <w:t>Le bon texte transcrit (comparaison manuelle avec l'audio).</w:t>
             </w:r>
           </w:p>
@@ -1589,7 +1808,15 @@
               </w:numPr>
             </w:pPr>
             <w:r>
-              <w:t>Mesurer le temps de traitement pour s'assurer qu'il est raisonnable pour un PC moyen (ex: moins de 3x la durée de l'audio pour un fichier de 5 min).</w:t>
+              <w:t>Mesurer le temps de traitement pour s'assurer qu'il est raisonnable pour un PC moyen (</w:t>
+            </w:r>
+            <w:proofErr w:type="gramStart"/>
+            <w:r>
+              <w:t>ex:</w:t>
+            </w:r>
+            <w:proofErr w:type="gramEnd"/>
+            <w:r>
+              <w:t xml:space="preserve"> moins de 3x la durée de l'audio pour un fichier de 5 min).</w:t>
             </w:r>
           </w:p>
           <w:p>
@@ -1600,7 +1827,6 @@
               </w:numPr>
             </w:pPr>
             <w:r>
-              <w:lastRenderedPageBreak/>
               <w:t>Vérifier le traitement par lot sur un répertoire contenant plusieurs fichiers.</w:t>
             </w:r>
           </w:p>
@@ -1701,6 +1927,201 @@
             </w:r>
           </w:p>
           <w:p/>
+        </w:tc>
+      </w:tr>
+    </w:tbl>
+    <w:p/>
+    <w:p/>
+    <w:p/>
+    <w:p>
+      <w:pPr>
+        <w:rPr>
+          <w:b/>
+          <w:bCs/>
+        </w:rPr>
+      </w:pPr>
+      <w:r>
+        <w:rPr>
+          <w:b/>
+          <w:bCs/>
+        </w:rPr>
+        <w:t xml:space="preserve">Publication </w:t>
+      </w:r>
+      <w:proofErr w:type="spellStart"/>
+      <w:r>
+        <w:rPr>
+          <w:b/>
+          <w:bCs/>
+        </w:rPr>
+        <w:t>Github</w:t>
+      </w:r>
+      <w:proofErr w:type="spellEnd"/>
+    </w:p>
+    <w:p/>
+    <w:p>
+      <w:proofErr w:type="gramStart"/>
+      <w:r>
+        <w:t>cd</w:t>
+      </w:r>
+      <w:proofErr w:type="gramEnd"/>
+      <w:r>
+        <w:t xml:space="preserve"> C:\scripts\Transcription</w:t>
+      </w:r>
+    </w:p>
+    <w:p>
+      <w:proofErr w:type="gramStart"/>
+      <w:r>
+        <w:t>git</w:t>
+      </w:r>
+      <w:proofErr w:type="gramEnd"/>
+      <w:r>
+        <w:t xml:space="preserve"> init</w:t>
+      </w:r>
+    </w:p>
+    <w:p>
+      <w:proofErr w:type="gramStart"/>
+      <w:r>
+        <w:t>git</w:t>
+      </w:r>
+      <w:proofErr w:type="gramEnd"/>
+      <w:r>
+        <w:t xml:space="preserve"> commit -m "Initial </w:t>
+      </w:r>
+      <w:proofErr w:type="gramStart"/>
+      <w:r>
+        <w:t>commit:</w:t>
+      </w:r>
+      <w:proofErr w:type="gramEnd"/>
+      <w:r>
+        <w:t xml:space="preserve"> Audio transcription </w:t>
+      </w:r>
+      <w:proofErr w:type="spellStart"/>
+      <w:r>
+        <w:t>with</w:t>
+      </w:r>
+      <w:proofErr w:type="spellEnd"/>
+      <w:r>
+        <w:t xml:space="preserve"> speaker </w:t>
+      </w:r>
+      <w:proofErr w:type="spellStart"/>
+      <w:r>
+        <w:t>diarization</w:t>
+      </w:r>
+      <w:proofErr w:type="spellEnd"/>
+      <w:r>
+        <w:t xml:space="preserve"> for M4A files"</w:t>
+      </w:r>
+    </w:p>
+    <w:p>
+      <w:pPr>
+        <w:rPr>
+          <w:b/>
+          <w:bCs/>
+        </w:rPr>
+      </w:pPr>
+      <w:r>
+        <w:rPr>
+          <w:b/>
+          <w:bCs/>
+        </w:rPr>
+        <w:t>Envoyer MAJ</w:t>
+      </w:r>
+    </w:p>
+    <w:tbl>
+      <w:tblPr>
+        <w:tblStyle w:val="Grilledutableau"/>
+        <w:tblW w:w="0" w:type="auto"/>
+        <w:tblLook w:val="04A0" w:firstRow="1" w:lastRow="0" w:firstColumn="1" w:lastColumn="0" w:noHBand="0" w:noVBand="1"/>
+      </w:tblPr>
+      <w:tblGrid>
+        <w:gridCol w:w="9062"/>
+      </w:tblGrid>
+      <w:tr>
+        <w:tc>
+          <w:tcPr>
+            <w:tcW w:w="9062" w:type="dxa"/>
+          </w:tcPr>
+          <w:p>
+            <w:proofErr w:type="gramStart"/>
+            <w:r>
+              <w:t>cd</w:t>
+            </w:r>
+            <w:proofErr w:type="gramEnd"/>
+            <w:r>
+              <w:t xml:space="preserve"> C:\scripts\Transcription</w:t>
+            </w:r>
+          </w:p>
+          <w:p/>
+          <w:p>
+            <w:proofErr w:type="gramStart"/>
+            <w:r>
+              <w:t>git</w:t>
+            </w:r>
+            <w:proofErr w:type="gramEnd"/>
+            <w:r>
+              <w:t xml:space="preserve"> diff --</w:t>
+            </w:r>
+            <w:proofErr w:type="spellStart"/>
+            <w:r>
+              <w:t>cached</w:t>
+            </w:r>
+            <w:proofErr w:type="spellEnd"/>
+          </w:p>
+          <w:p/>
+          <w:p/>
+          <w:p>
+            <w:proofErr w:type="gramStart"/>
+            <w:r>
+              <w:t>git</w:t>
+            </w:r>
+            <w:proofErr w:type="gramEnd"/>
+            <w:r>
+              <w:t xml:space="preserve"> </w:t>
+            </w:r>
+            <w:proofErr w:type="spellStart"/>
+            <w:r>
+              <w:t>status</w:t>
+            </w:r>
+            <w:proofErr w:type="spellEnd"/>
+          </w:p>
+          <w:p>
+            <w:proofErr w:type="gramStart"/>
+            <w:r>
+              <w:t>git</w:t>
+            </w:r>
+            <w:proofErr w:type="gramEnd"/>
+            <w:r>
+              <w:t xml:space="preserve"> </w:t>
+            </w:r>
+            <w:proofErr w:type="spellStart"/>
+            <w:r>
+              <w:t>add</w:t>
+            </w:r>
+            <w:proofErr w:type="spellEnd"/>
+            <w:r>
+              <w:t xml:space="preserve"> -A</w:t>
+            </w:r>
+          </w:p>
+          <w:p>
+            <w:proofErr w:type="gramStart"/>
+            <w:r>
+              <w:t>git</w:t>
+            </w:r>
+            <w:proofErr w:type="gramEnd"/>
+            <w:r>
+              <w:t xml:space="preserve"> commit -m "Description de la modification"</w:t>
+            </w:r>
+          </w:p>
+          <w:p>
+            <w:proofErr w:type="gramStart"/>
+            <w:r>
+              <w:t>git</w:t>
+            </w:r>
+            <w:proofErr w:type="gramEnd"/>
+            <w:r>
+              <w:t xml:space="preserve"> push</w:t>
+            </w:r>
+          </w:p>
         </w:tc>
       </w:tr>
     </w:tbl>
@@ -4375,6 +4796,29 @@
       </w:tblBorders>
     </w:tblPr>
   </w:style>
+  <w:style w:type="character" w:styleId="Lienhypertexte">
+    <w:name w:val="Hyperlink"/>
+    <w:basedOn w:val="Policepardfaut"/>
+    <w:uiPriority w:val="99"/>
+    <w:unhideWhenUsed/>
+    <w:rsid w:val="00D573C3"/>
+    <w:rPr>
+      <w:color w:val="467886" w:themeColor="hyperlink"/>
+      <w:u w:val="single"/>
+    </w:rPr>
+  </w:style>
+  <w:style w:type="character" w:styleId="Mentionnonrsolue">
+    <w:name w:val="Unresolved Mention"/>
+    <w:basedOn w:val="Policepardfaut"/>
+    <w:uiPriority w:val="99"/>
+    <w:semiHidden/>
+    <w:unhideWhenUsed/>
+    <w:rsid w:val="00D573C3"/>
+    <w:rPr>
+      <w:color w:val="605E5C"/>
+      <w:shd w:val="clear" w:color="auto" w:fill="E1DFDD"/>
+    </w:rPr>
+  </w:style>
 </w:styles>
 </file>
 

</xml_diff>